<commit_message>
updated logos and titles
</commit_message>
<xml_diff>
--- a/for co pilot.docx
+++ b/for co pilot.docx
@@ -18474,6 +18474,279 @@
     <w:p>
       <w:r>
         <w:t>}</w:t>
+      </w:r>
+    </w:p>
+    <w:p>
+      <w:r>
+        <w:t>.navmenu .active {</w:t>
+      </w:r>
+    </w:p>
+    <w:p>
+      <w:r>
+        <w:t xml:space="preserve">    font-weight: 400 !important;</w:t>
+      </w:r>
+    </w:p>
+    <w:p>
+      <w:r>
+        <w:t>}</w:t>
+      </w:r>
+    </w:p>
+    <w:p>
+      <w:r>
+        <w:t>/* Make active nav item not appear bolder */</w:t>
+      </w:r>
+    </w:p>
+    <w:p>
+      <w:r>
+        <w:t>:root {</w:t>
+      </w:r>
+    </w:p>
+    <w:p>
+      <w:r>
+        <w:t xml:space="preserve">    --nav-hover-color: #666666; /* or even #999999 to match exactly */</w:t>
+      </w:r>
+    </w:p>
+    <w:p>
+      <w:r>
+        <w:t>}</w:t>
+      </w:r>
+    </w:p>
+    <w:p>
+      <w:r>
+        <w:t>:root {</w:t>
+      </w:r>
+    </w:p>
+    <w:p>
+      <w:r>
+        <w:t xml:space="preserve">    --nav-hover-color: #555555; /* medium gray */</w:t>
+      </w:r>
+    </w:p>
+    <w:p>
+      <w:r>
+        <w:t>}</w:t>
+      </w:r>
+    </w:p>
+    <w:p/>
+    <w:p>
+      <w:r>
+        <w:t>/*--------------------------------------------------------------</w:t>
+      </w:r>
+    </w:p>
+    <w:p>
+      <w:r>
+        <w:t># Font for header</w:t>
+      </w:r>
+    </w:p>
+    <w:p>
+      <w:r>
+        <w:t>--------------------------------------------------------------*/</w:t>
+      </w:r>
+    </w:p>
+    <w:p/>
+    <w:p>
+      <w:r>
+        <w:t>.sitename {</w:t>
+      </w:r>
+    </w:p>
+    <w:p>
+      <w:r>
+        <w:lastRenderedPageBreak/>
+        <w:t xml:space="preserve">    font-family: 'DejaVu Serif', serif;</w:t>
+      </w:r>
+    </w:p>
+    <w:p>
+      <w:r>
+        <w:t xml:space="preserve">    font-weight: 700;</w:t>
+      </w:r>
+    </w:p>
+    <w:p>
+      <w:r>
+        <w:t xml:space="preserve">    color: #0A2B61;</w:t>
+      </w:r>
+    </w:p>
+    <w:p>
+      <w:r>
+        <w:t xml:space="preserve">    margin: 0;</w:t>
+      </w:r>
+    </w:p>
+    <w:p>
+      <w:r>
+        <w:t xml:space="preserve">    padding: 0;</w:t>
+      </w:r>
+    </w:p>
+    <w:p>
+      <w:r>
+        <w:t xml:space="preserve">    line-height: 1;</w:t>
+      </w:r>
+    </w:p>
+    <w:p>
+      <w:r>
+        <w:t>}</w:t>
+      </w:r>
+    </w:p>
+    <w:p/>
+    <w:p>
+      <w:r>
+        <w:t>.header .logo .sitename {</w:t>
+      </w:r>
+    </w:p>
+    <w:p>
+      <w:r>
+        <w:t xml:space="preserve">    font-family: 'DejaVu Serif', serif;</w:t>
+      </w:r>
+    </w:p>
+    <w:p>
+      <w:r>
+        <w:t xml:space="preserve">    font-weight: 700;</w:t>
+      </w:r>
+    </w:p>
+    <w:p>
+      <w:r>
+        <w:t xml:space="preserve">    color: #0A2B61 !important;</w:t>
+      </w:r>
+    </w:p>
+    <w:p>
+      <w:r>
+        <w:t>}</w:t>
+      </w:r>
+    </w:p>
+    <w:p/>
+    <w:p>
+      <w:r>
+        <w:t>.page-title .title-wrapper h1 {</w:t>
+      </w:r>
+    </w:p>
+    <w:p>
+      <w:r>
+        <w:t xml:space="preserve">    font-family: 'DejaVu Serif', serif;</w:t>
+      </w:r>
+    </w:p>
+    <w:p>
+      <w:r>
+        <w:t xml:space="preserve">    font-weight: 700;</w:t>
+      </w:r>
+    </w:p>
+    <w:p>
+      <w:r>
+        <w:t xml:space="preserve">    color: #0A2B61;</w:t>
+      </w:r>
+    </w:p>
+    <w:p>
+      <w:r>
+        <w:t>}</w:t>
+      </w:r>
+    </w:p>
+    <w:p/>
+    <w:p>
+      <w:r>
+        <w:t>.page-title .title-wrapper h1 {</w:t>
+      </w:r>
+    </w:p>
+    <w:p>
+      <w:r>
+        <w:t xml:space="preserve">    font-family: 'DejaVu Serif', serif;</w:t>
+      </w:r>
+    </w:p>
+    <w:p>
+      <w:r>
+        <w:t xml:space="preserve">    font-weight: 700;</w:t>
+      </w:r>
+    </w:p>
+    <w:p>
+      <w:r>
+        <w:t xml:space="preserve">    color: #0A2B61;</w:t>
+      </w:r>
+    </w:p>
+    <w:p>
+      <w:r>
+        <w:t xml:space="preserve">    letter-spacing: 1px;</w:t>
+      </w:r>
+    </w:p>
+    <w:p>
+      <w:r>
+        <w:t xml:space="preserve">    font-size: 3rem;</w:t>
+      </w:r>
+    </w:p>
+    <w:p>
+      <w:r>
+        <w:t xml:space="preserve">    position: relative;</w:t>
+      </w:r>
+    </w:p>
+    <w:p>
+      <w:r>
+        <w:t xml:space="preserve">    padding-bottom: 12px;</w:t>
+      </w:r>
+    </w:p>
+    <w:p>
+      <w:r>
+        <w:t xml:space="preserve">    display: block; /* forces full width */</w:t>
+      </w:r>
+    </w:p>
+    <w:p>
+      <w:r>
+        <w:t xml:space="preserve">    text-align: center; /* keeps the text centered */</w:t>
+      </w:r>
+    </w:p>
+    <w:p>
+      <w:r>
+        <w:lastRenderedPageBreak/>
+        <w:t>}</w:t>
+      </w:r>
+    </w:p>
+    <w:p/>
+    <w:p>
+      <w:r>
+        <w:t xml:space="preserve">    .page-title .title-wrapper h1::after {</w:t>
+      </w:r>
+    </w:p>
+    <w:p>
+      <w:r>
+        <w:t xml:space="preserve">        content: "";</w:t>
+      </w:r>
+    </w:p>
+    <w:p>
+      <w:r>
+        <w:t xml:space="preserve">        position: absolute;</w:t>
+      </w:r>
+    </w:p>
+    <w:p>
+      <w:r>
+        <w:t xml:space="preserve">        left: 50%; /* center of the full-width block */</w:t>
+      </w:r>
+    </w:p>
+    <w:p>
+      <w:r>
+        <w:t xml:space="preserve">        bottom: 0;</w:t>
+      </w:r>
+    </w:p>
+    <w:p>
+      <w:r>
+        <w:t xml:space="preserve">        transform: translateX(-50%);</w:t>
+      </w:r>
+    </w:p>
+    <w:p>
+      <w:r>
+        <w:t xml:space="preserve">        width: 60px;</w:t>
+      </w:r>
+    </w:p>
+    <w:p>
+      <w:r>
+        <w:t xml:space="preserve">        height: 3px;</w:t>
+      </w:r>
+    </w:p>
+    <w:p>
+      <w:r>
+        <w:t xml:space="preserve">        background-color: #0A2B61;</w:t>
+      </w:r>
+    </w:p>
+    <w:p>
+      <w:r>
+        <w:t xml:space="preserve">        border-radius: 2px;</w:t>
+      </w:r>
+    </w:p>
+    <w:p>
+      <w:r>
+        <w:t xml:space="preserve">    }</w:t>
       </w:r>
     </w:p>
     <w:sectPr>

</xml_diff>